<commit_message>
Update report figures after the review fixes
Line counts, bundle sizes and the accessibility section were measured
before the review fixes landed and no longer matched the code.

Co-Authored-By: Claude Opus 5 (1M context) <noreply@anthropic.com>
</commit_message>
<xml_diff>
--- a/DG-Interns-Hub-Project-Report.docx
+++ b/DG-Interns-Hub-Project-Report.docx
@@ -685,7 +685,7 @@
           <w:sz w:val="21"/>
           <w:szCs w:val="21"/>
         </w:rPr>
-        <w:t xml:space="preserve">The interface is styled with hand-written CSS driven by custom properties rather than a third-party framework, which keeps the production stylesheet at 3.59 KB gzipped and makes the entire visual theme adjustable from a single declaration block. The project totals approximately 1,412 lines of source across eleven files and builds to a 88.89 KB gzipped JavaScript bundle.</w:t>
+        <w:t xml:space="preserve">The interface is styled with hand-written CSS driven by custom properties rather than a third-party framework, which keeps the production stylesheet at 3.69 KB gzipped and makes the entire visual theme adjustable from a single declaration block. The project totals approximately 1,494 lines of source across eleven files and builds to an 89.25 KB gzipped JavaScript bundle.</w:t>
       </w:r>
     </w:p>
     <w:p>
@@ -1541,7 +1541,7 @@
                 <w:sz w:val="19"/>
                 <w:szCs w:val="19"/>
               </w:rPr>
-              <w:t xml:space="preserve">src/index.css (339 lines)</w:t>
+              <w:t xml:space="preserve">src/index.css (345 lines)</w:t>
             </w:r>
           </w:p>
         </w:tc>
@@ -2264,7 +2264,7 @@
           <w:sz w:val="21"/>
           <w:szCs w:val="21"/>
         </w:rPr>
-        <w:t xml:space="preserve">Vite was preferred over Create React App because it starts in well under a second, applies hot module replacement without losing component state, and produces a tree-shaken production bundle. The measured output is 284.06 KB of JavaScript (88.89 KB gzipped) and 13.79 KB of CSS (3.59 KB gzipped).</w:t>
+        <w:t xml:space="preserve">Vite was preferred over Create React App because it starts in well under a second, applies hot module replacement without losing component state, and produces a tree-shaken production bundle. The measured output is 284.82 KB of JavaScript (89.25 KB gzipped) and 14.18 KB of CSS (3.69 KB gzipped).</w:t>
       </w:r>
     </w:p>
     <w:p>
@@ -2277,7 +2277,7 @@
           <w:sz w:val="21"/>
           <w:szCs w:val="21"/>
         </w:rPr>
-        <w:t xml:space="preserve">No CSS framework was used. Bootstrap or Tailwind would have produced the same visual result faster, but writing the stylesheet by hand forced explicit decisions about the type scale, spacing rhythm, colour roles and breakpoints — which is the part of the exercise with lasting value. The cost of that choice was roughly 339 lines of CSS; the benefit is a stylesheet in which every rule is understood and a theme that is adjustable from one block of custom properties.</w:t>
+        <w:t xml:space="preserve">No CSS framework was used. Bootstrap or Tailwind would have produced the same visual result faster, but writing the stylesheet by hand forced explicit decisions about the type scale, spacing rhythm, colour roles and breakpoints — which is the part of the exercise with lasting value. The cost of that choice was roughly 345 lines of CSS; the benefit is a stylesheet in which every rule is understood and a theme that is adjustable from one block of custom properties.</w:t>
       </w:r>
     </w:p>
     <w:p>
@@ -2885,7 +2885,7 @@
           <w:sz w:val="18"/>
           <w:szCs w:val="18"/>
         </w:rPr>
-        <w:t xml:space="preserve">│   │   ├── Navbar.jsx         54 lines</w:t>
+        <w:t xml:space="preserve">│   │   ├── Navbar.jsx         66 lines</w:t>
       </w:r>
     </w:p>
     <w:p>
@@ -2923,26 +2923,26 @@
           <w:sz w:val="18"/>
           <w:szCs w:val="18"/>
         </w:rPr>
-        <w:t xml:space="preserve">│   │   ├── JobCard.jsx        45 lines</w:t>
-      </w:r>
-    </w:p>
-    <w:p>
-      <w:pPr>
-        <w:pBdr>
-          <w:left w:val="single" w:color="4F46E5" w:sz="12"/>
-          <w:right w:val="single" w:color="D9DEE7" w:sz="4"/>
-        </w:pBdr>
-        <w:shd w:fill="F6F7F9" w:color="auto" w:val="clear"/>
-        <w:spacing w:after="0"/>
-      </w:pPr>
-      <w:r>
-        <w:rPr>
-          <w:rFonts w:ascii="Consolas" w:cs="Consolas" w:eastAsia="Consolas" w:hAnsi="Consolas"/>
-          <w:color w:val="0F172A"/>
-          <w:sz w:val="18"/>
-          <w:szCs w:val="18"/>
-        </w:rPr>
-        <w:t xml:space="preserve">│   │   └── ApplyModal.jsx    160 lines</w:t>
+        <w:t xml:space="preserve">│   │   ├── JobCard.jsx        49 lines</w:t>
+      </w:r>
+    </w:p>
+    <w:p>
+      <w:pPr>
+        <w:pBdr>
+          <w:left w:val="single" w:color="4F46E5" w:sz="12"/>
+          <w:right w:val="single" w:color="D9DEE7" w:sz="4"/>
+        </w:pBdr>
+        <w:shd w:fill="F6F7F9" w:color="auto" w:val="clear"/>
+        <w:spacing w:after="0"/>
+      </w:pPr>
+      <w:r>
+        <w:rPr>
+          <w:rFonts w:ascii="Consolas" w:cs="Consolas" w:eastAsia="Consolas" w:hAnsi="Consolas"/>
+          <w:color w:val="0F172A"/>
+          <w:sz w:val="18"/>
+          <w:szCs w:val="18"/>
+        </w:rPr>
+        <w:t xml:space="preserve">│   │   └── ApplyModal.jsx    209 lines</w:t>
       </w:r>
     </w:p>
     <w:p>
@@ -3018,26 +3018,26 @@
           <w:sz w:val="18"/>
           <w:szCs w:val="18"/>
         </w:rPr>
-        <w:t xml:space="preserve">│   │   ├── Home.jsx          194 lines</w:t>
-      </w:r>
-    </w:p>
-    <w:p>
-      <w:pPr>
-        <w:pBdr>
-          <w:left w:val="single" w:color="4F46E5" w:sz="12"/>
-          <w:right w:val="single" w:color="D9DEE7" w:sz="4"/>
-        </w:pBdr>
-        <w:shd w:fill="F6F7F9" w:color="auto" w:val="clear"/>
-        <w:spacing w:after="0"/>
-      </w:pPr>
-      <w:r>
-        <w:rPr>
-          <w:rFonts w:ascii="Consolas" w:cs="Consolas" w:eastAsia="Consolas" w:hAnsi="Consolas"/>
-          <w:color w:val="0F172A"/>
-          <w:sz w:val="18"/>
-          <w:szCs w:val="18"/>
-        </w:rPr>
-        <w:t xml:space="preserve">│   │   ├── Jobs.jsx          123 lines</w:t>
+        <w:t xml:space="preserve">│   │   ├── Home.jsx          198 lines</w:t>
+      </w:r>
+    </w:p>
+    <w:p>
+      <w:pPr>
+        <w:pBdr>
+          <w:left w:val="single" w:color="4F46E5" w:sz="12"/>
+          <w:right w:val="single" w:color="D9DEE7" w:sz="4"/>
+        </w:pBdr>
+        <w:shd w:fill="F6F7F9" w:color="auto" w:val="clear"/>
+        <w:spacing w:after="0"/>
+      </w:pPr>
+      <w:r>
+        <w:rPr>
+          <w:rFonts w:ascii="Consolas" w:cs="Consolas" w:eastAsia="Consolas" w:hAnsi="Consolas"/>
+          <w:color w:val="0F172A"/>
+          <w:sz w:val="18"/>
+          <w:szCs w:val="18"/>
+        </w:rPr>
+        <w:t xml:space="preserve">│   │   ├── Jobs.jsx          127 lines</w:t>
       </w:r>
     </w:p>
     <w:p>
@@ -3075,7 +3075,7 @@
           <w:sz w:val="18"/>
           <w:szCs w:val="18"/>
         </w:rPr>
-        <w:t xml:space="preserve">│   ├── App.jsx                49 lines</w:t>
+        <w:t xml:space="preserve">│   ├── App.jsx                52 lines</w:t>
       </w:r>
     </w:p>
     <w:p>
@@ -3113,7 +3113,7 @@
           <w:sz w:val="18"/>
           <w:szCs w:val="18"/>
         </w:rPr>
-        <w:t xml:space="preserve">│   └── index.css             339 lines</w:t>
+        <w:t xml:space="preserve">│   └── index.css             345 lines</w:t>
       </w:r>
     </w:p>
     <w:p>
@@ -6740,7 +6740,7 @@
                 <w:sz w:val="19"/>
                 <w:szCs w:val="19"/>
               </w:rPr>
-              <w:t xml:space="preserve">13.79 KB</w:t>
+              <w:t xml:space="preserve">14.18 KB</w:t>
             </w:r>
           </w:p>
         </w:tc>
@@ -6764,7 +6764,7 @@
                 <w:sz w:val="19"/>
                 <w:szCs w:val="19"/>
               </w:rPr>
-              <w:t xml:space="preserve">3.59 KB</w:t>
+              <w:t xml:space="preserve">3.69 KB</w:t>
             </w:r>
           </w:p>
         </w:tc>
@@ -6814,7 +6814,7 @@
                 <w:sz w:val="19"/>
                 <w:szCs w:val="19"/>
               </w:rPr>
-              <w:t xml:space="preserve">284.06 KB</w:t>
+              <w:t xml:space="preserve">284.82 KB</w:t>
             </w:r>
           </w:p>
         </w:tc>
@@ -6838,7 +6838,7 @@
                 <w:sz w:val="19"/>
                 <w:szCs w:val="19"/>
               </w:rPr>
-              <w:t xml:space="preserve">88.89 KB</w:t>
+              <w:t xml:space="preserve">89.25 KB</w:t>
             </w:r>
           </w:p>
         </w:tc>
@@ -6945,7 +6945,25 @@
           <w:sz w:val="21"/>
           <w:szCs w:val="21"/>
         </w:rPr>
-        <w:t xml:space="preserve">The dialog declares role="dialog", aria-modal and an accessible name, and closes on Escape.</w:t>
+        <w:t xml:space="preserve">The dialog declares role="dialog", aria-modal and an accessible name, moves focus into itself on open, traps Tab, restores focus to the trigger on close, and closes on Escape.</w:t>
+      </w:r>
+    </w:p>
+    <w:p>
+      <w:pPr>
+        <w:pStyle w:val="ListParagraph"/>
+        <w:numPr>
+          <w:ilvl w:val="0"/>
+          <w:numId w:val="2"/>
+        </w:numPr>
+        <w:spacing w:after="90" w:line="276"/>
+      </w:pPr>
+      <w:r>
+        <w:rPr>
+          <w:color w:val="0F172A"/>
+          <w:sz w:val="21"/>
+          <w:szCs w:val="21"/>
+        </w:rPr>
+        <w:t xml:space="preserve">Invalid fields carry aria-invalid and aria-describedby, error messages announce through role="alert", and submitting an invalid form focuses the first field at fault.</w:t>
       </w:r>
     </w:p>
     <w:p>
@@ -8150,7 +8168,7 @@
           <w:sz w:val="21"/>
           <w:szCs w:val="21"/>
         </w:rPr>
-        <w:t xml:space="preserve">Nine listings differ in company, location, work type, stipend, skill count and urgency. Settling the shape of a job record before writing any markup is what allowed a single 45-line component to render all of them with no conditional branches. Had the markup come first, the component would have accumulated special cases.</w:t>
+        <w:t xml:space="preserve">Nine listings differ in company, location, work type, stipend, skill count and urgency. Settling the shape of a job record before writing any markup is what allowed a single compact component to render all of them with no conditional branches. Had the markup come first, the component would have accumulated special cases.</w:t>
       </w:r>
     </w:p>
     <w:p>

</xml_diff>